<commit_message>
feat: update graduation project implementation and docs
</commit_message>
<xml_diff>
--- a/docx/基于大语言模型的智能穿搭推荐系统_毕业设计成果.docx
+++ b/docx/基于大语言模型的智能穿搭推荐系统_毕业设计成果.docx
@@ -775,7 +775,7 @@
           <w:b w:val="0"/>
           <w:sz w:val="21"/>
         </w:rPr>
-        <w:t>用户完成基础信息、风格偏好、色彩倾向和衣橱标签后，系统调用阿里云百炼平台的通义千问 API 生成结构化个人风格档案。档案包含推荐风格、可尝试风格、适配颜色、推荐单品和简短理由；风潮页面读取该档案并与全局趋势分区展示，不将全局热度直接视为个人偏好。</w:t>
+        <w:t>用户完成基础信息、风格偏好、色彩倾向和衣橱标签后，系统使用当前已实现的确定性 development fallback 生成并持久化结构化个人风格档案。档案包含推荐风格、可尝试风格、适配颜色、推荐单品和简短理由；风潮页面读取该档案并与全局趋势分区展示，不将全局热度直接视为个人偏好。百炼风格分析属于后续生产化扩展，不作为当前已实现能力。</w:t>
       </w:r>
     </w:p>
     <w:p>
@@ -8754,7 +8754,7 @@
           <w:b w:val="0"/>
           <w:sz w:val="21"/>
         </w:rPr>
-        <w:t>风潮页面分为“全局风潮”和“我的风格”两个区域。全局风潮优先展示已配置的授权 JSON 趋势源，按来源平台和主题标签展示趋势卡片，卡片包括标题或话题、热度、来源、发布时间或采集时间和原文跳转链接；页面必须标注“聚合自公开来源”，不复制受限全文、不展示个人账号资料，也不将其他平台内容伪装为本站原创。我的风格区域读取已保存的 LLM 风格档案，展示当前推荐风格、推荐搭配、建议单品、颜色搭配和可尝试风格。趋势源不可用或数据不合规时，返回明确标注的开发样本，不把内置样本冒充实时平台数据。</w:t>
+        <w:t>风潮页面分为“全局风潮”和“我的风格”两个区域。全局风潮优先展示已配置的授权 JSON 趋势源，按来源平台和主题标签展示趋势卡片，卡片包括标题或话题、热度、来源、发布时间或采集时间和原文跳转链接；页面必须标注“聚合自公开来源”，不复制受限全文、不展示个人账号资料，也不将其他平台内容伪装为本站原创。我的风格区域读取已保存的本地确定性风格档案，展示当前推荐风格、推荐搭配、建议单品、颜色搭配和可尝试风格。趋势源不可用或数据不合规时，返回明确标注的开发样本，不把内置样本冒充实时平台数据。</w:t>
       </w:r>
     </w:p>
     <w:p>
@@ -10117,7 +10117,7 @@
           <w:b w:val="0"/>
           <w:sz w:val="21"/>
         </w:rPr>
-        <w:t>用户资料和衣橱标签变化后，将 sourceProfileHash 与已保存档案比对；不一致时标记档案过期。页面读取已保存档案，不在每次进入风潮页时调用模型。模型调用超时或返回非法 JSON 时保留上一份有效档案并标记 styleProfileStale=true；首次生成失败则返回可理解的补充信息提示。</w:t>
+        <w:t>当前实现把用户资料和偏好列表归一化后生成确定性档案并保存，页面读取已保存档案，不在每次进入风潮页时调用模型。档案状态来自服务端保存结果；未来接入外部模型时，才需要增加 sourceProfileHash、超时、非法 JSON、旧档案保留和 stale 标记等治理逻辑。</w:t>
       </w:r>
     </w:p>
     <w:p>
@@ -12340,7 +12340,7 @@
                 <w:b w:val="0"/>
                 <w:sz w:val="17"/>
               </w:rPr>
-              <w:t>返回已保存的风格档案及是否过期。</w:t>
+              <w:t>返回已保存的确定性风格档案及状态。</w:t>
             </w:r>
           </w:p>
         </w:tc>
@@ -12482,7 +12482,7 @@
                 <w:b w:val="0"/>
                 <w:sz w:val="17"/>
               </w:rPr>
-              <w:t>调用百炼 API 生成新档案。</w:t>
+              <w:t>按用户输入重新生成并保存本地 development fallback 档案。</w:t>
             </w:r>
           </w:p>
         </w:tc>
@@ -13234,7 +13234,7 @@
           <w:b w:val="0"/>
           <w:sz w:val="21"/>
         </w:rPr>
-        <w:t>GET /api/v1/me/style-profile 返回当前登录用户的已保存档案；POST /api/v1/me/style-profile/refresh 仅在用户主动触发时调用百炼 API。响应包含 styleTags、tryStyleTags、colorSuggestions、itemSuggestions、reasonSummary、generatedAt 和 stale。用户资料不完整时返回 422 和 STYLE_PROFILE_INCOMPLETE；百炼服务异常时首次生成返回 503，已有有效档案则返回 200 且 stale=true。</w:t>
+        <w:t>GET /api/v1/me/style-profile 返回当前登录用户的已保存档案；POST /api/v1/me/style-profile/refresh 按用户输入重新生成并保存确定性 development fallback。响应包含 styleTags、tryStyleTags、colorSuggestions、itemSuggestions、reasonSummary、generatedAt 和 stale；当前 stale 固定为 false，未接入外部风格模型。</w:t>
       </w:r>
     </w:p>
     <w:p>
@@ -13264,7 +13264,7 @@
           <w:b w:val="0"/>
           <w:sz w:val="21"/>
         </w:rPr>
-        <w:t>测试围绕真实业务约束设计，全部为仓库内自动化测试的真实执行结果：后端 Maven 测试 61 项全部通过，前端 Playwright E2E 4 项通过。测试覆盖认证、跨用户隔离、CSRF、Flyway 迁移、LLM 结果校验与降级、推荐审计、图片删除清理、历史分页、输入长度、天气与离线天气降级、趋势源校验等边界。</w:t>
+        <w:t>测试围绕真实业务约束设计，覆盖认证、跨用户隔离、CSRF、Flyway 迁移、LLM 结果校验与降级、推荐审计、图片删除清理、历史分页、输入长度、天气与离线天气降级、趋势源校验等边界。测试结论必须以当前执行记录为准：本轮主机回归已验证后端 Maven 测试与离线评估；Docker 未运行，因此前端 Playwright E2E 本轮标记为未执行，不把历史结果冒充为当前证据。</w:t>
       </w:r>
     </w:p>
     <w:p>
@@ -14581,7 +14581,7 @@
           <w:b w:val="0"/>
           <w:sz w:val="21"/>
         </w:rPr>
-        <w:t>合计 61 项测试，0 失败、0 错误、0 跳过。</w:t>
+        <w:t>后端测试数量与结果以本轮 Surefire 报告为准；本轮执行记录为 62 项测试，0 失败、0 错误、0 跳过。若代码修复新增测试，应重新生成本文档后更新该数字。</w:t>
       </w:r>
     </w:p>
     <w:p>
@@ -14796,7 +14796,7 @@
                 <w:b w:val="0"/>
                 <w:sz w:val="17"/>
               </w:rPr>
-              <w:t>通过</w:t>
+              <w:t>本轮未执行</w:t>
             </w:r>
           </w:p>
         </w:tc>
@@ -14882,7 +14882,7 @@
                 <w:b w:val="0"/>
                 <w:sz w:val="17"/>
               </w:rPr>
-              <w:t>通过</w:t>
+              <w:t>本轮未执行</w:t>
             </w:r>
           </w:p>
         </w:tc>
@@ -14968,7 +14968,7 @@
                 <w:b w:val="0"/>
                 <w:sz w:val="17"/>
               </w:rPr>
-              <w:t>通过</w:t>
+              <w:t>本轮未执行</w:t>
             </w:r>
           </w:p>
         </w:tc>
@@ -15054,7 +15054,7 @@
                 <w:b w:val="0"/>
                 <w:sz w:val="17"/>
               </w:rPr>
-              <w:t>通过</w:t>
+              <w:t>本轮未执行</w:t>
             </w:r>
           </w:p>
         </w:tc>
@@ -15073,7 +15073,7 @@
           <w:b w:val="0"/>
           <w:sz w:val="21"/>
         </w:rPr>
-        <w:t>E2E 使用独立测试用户，通过真实页面完成闭环，并从后端历史接口复核 saved=true。</w:t>
+        <w:t>本轮因 Docker Desktop 未运行未执行 Playwright；历史记录中曾有 4 项通过，但不作为本轮验收结论。</w:t>
       </w:r>
     </w:p>
     <w:p>
@@ -15238,7 +15238,7 @@
           <w:b w:val="0"/>
           <w:sz w:val="21"/>
         </w:rPr>
-        <w:t>• 执行 docker compose --profile app up --build -d，检查 frontend、backend、postgres、minio 容器均为 healthy。</w:t>
+        <w:t>• 执行 docker compose --profile app up --build -d，检查 postgres、minio 的健康检查与 backend 的 /actuator/health；frontend 通过 HTTP 页面和 API 代理可访问性验证。Compose 未为 frontend/backend 声明 healthcheck，不应把它们写成 healthy。</w:t>
       </w:r>
     </w:p>
     <w:p>

</xml_diff>